<commit_message>
WP08: sprzęt i amortyzacja (K3-48..58), 14 pozycji, D42, N72-N73, T33-T35; 7.4 odpady po likwidacji
Co-Authored-By: Claude Sonnet 5.5 <noreply@anthropic.com>
Claude-Session: https://claude.ai/code/session_01672WnJhixnEcarbb7uiwfx
</commit_message>
<xml_diff>
--- a/Sekcja_7_zasady_horyzontalne_6R.docx
+++ b/Sekcja_7_zasady_horyzontalne_6R.docx
@@ -1341,7 +1341,7 @@
           <w:color w:val="666666"/>
           <w:sz w:val="17"/>
         </w:rPr>
-        <w:t xml:space="preserve"> [755 znaków]</w:t>
+        <w:t xml:space="preserve"> [796 znaków]</w:t>
       </w:r>
     </w:p>
     <w:p>
@@ -1352,7 +1352,7 @@
         <w:rPr>
           <w:b w:val="0"/>
         </w:rPr>
-        <w:t>Projekt będzie realizowany zgodnie z ustawą z 14.12.2012 o odpadach. W trakcie prac powstaną odpady elektroniczne: zużyte lub uszkodzone komponenty zestawów prototypowych, płytki, czujniki i akumulatory bufora zasilania. Prototypy po zakończeniu Z9 zostaną zdemontowane i wycofane z pojazdów, a żadne nie zostaną celowo zniszczone. Sprawne komponenty trafią do dalszych prac rozwojowych lub zostaną zestawami demonstracyjnymi. Niesprawne zostaną przekazane uprawnionym podmiotom zbierającym zużyty sprzęt elektryczny i elektroniczny, a akumulatory do punktu zbierania baterii, z dokumentem przekazania. Konsorcjum będzie postępować według hierarchii z art. 17 ustawy: zapobieganie, ponowne użycie, recykling. Obowiązek ten wynika także z umowy konsorcjum.</w:t>
+        <w:t>Projekt będzie realizowany zgodnie z ustawą z 14.12.2012 o odpadach. W trakcie prac powstaną odpady elektroniczne: zużyte lub uszkodzone komponenty zestawów prototypowych, płytki, czujniki i akumulatory bufora zasilania. Prototypy po zakończeniu Z9 zostaną zdemontowane i wycofane z pojazdów, a następnie zlikwidowane protokołem likwidacji środka trwałego, a żadne nie zostaną celowo zniszczone w toku badań. Konsorcjum nie wykorzysta ich po zakończeniu projektu. Zużyty sprzęt zostanie przekazany uprawnionym podmiotom zbierającym zużyty sprzęt elektryczny i elektroniczny, a akumulatory do punktu zbierania baterii, z dokumentem przekazania. Konsorcjum będzie postępować według hierarchii z art. 17 ustawy: zapobieganie, ponowne użycie, recykling. Obowiązek ten wynika także z umowy konsorcjum.</w:t>
       </w:r>
     </w:p>
     <w:p>

</xml_diff>